<commit_message>
docs(paper): sincroniza resumenes de portada y version ES
- Iguala el abstract de title_page con el del manuscrito (242 palabras).
- Acorta el resumen en espanol para reflejar la version final.
- Regenera title_page y manuscrito_es en DOCX, HTML y PDF.
</commit_message>
<xml_diff>
--- a/entregables/manuscrito_es.docx
+++ b/entregables/manuscrito_es.docx
@@ -164,7 +164,62 @@
         <w:pStyle w:val="FirstParagraph"/>
       </w:pPr>
       <w:r>
-        <w:t xml:space="preserve">La predicción operativa de incendios con aprendizaje automático sufre a menudo fugas espaciales y una transferibilidad limitada de los índices boreales a biomas subtropicales. Presentamos D2, un operador de objetivos computacional que separa formalmente la ignición primaria de la propagación táctica, y un marco de inferencia con gating y evaluación que hace explícitos la construcción del objetivo, el control de fuga y la comparación de modelos. D2 define la ignición como fuego en el día t sin fuego t-1 a menos de 25 km y sin fuego en la misma celda en los 10 días previos; la propagación se evalúa a menos de 25 km de un fuego t-1. Un gate biofísico elimina celdas-día no combustibles y húmedas. Un modelo híbrido LightGBM (M3) predice ignición sin insumos de fuego t-1, con M2 como fallback para celdas sin historia y M1 como baseline biofísico. En validación 2023, M3 alcanza ROC-AUC 0.7844/0.7628 (Chaco/Oriental), frente a 0.7817/0.7496 de M2; el baseline biofísico M1 se reporta en la Tabla S16 del suplemento. En bloques espaciales de desarrollo 2023, M2 es el más robusto (0.6773/0.7470) y M1 no supera a M2 en celdas sin historia, por lo que M1 se rechaza como fallback operativo (Tablas S8 y S16 del suplemento). Un holdout independiente de bloques de confirmación 2023 retuvo a M2 como el mejor modelo (0.6871/0.6621), por delante de M3 (0.6757/0.6344) y M1 (0.6435/0.6388). En el test retrospectivo 2024–2025, M3 alcanza 0.8021/0.7534 frente a 0.5173/0.5564 del FWI canadiense y 0.5389/0.4990 del INPE; la propagación alcanza 0.9039/0.7859. La precisión poblacional de ignición es solo 0.082 %/0.198 %, por lo que el sistema es una herramienta de nowcast y priorización, no un sistema de alerta autónomo. El test 2024–2025 ya fue observado y se reporta como retrospectivo, no como ciego. La contribución computacional es el operador D2, la política de inferencia con gating y un arnés de evaluación reutilizable, publicado como software abierto; el aprendiz es una elección de implementación, no la novedad.</w:t>
+        <w:t xml:space="preserve">La predicción de incendios con aprendizaje automático sufre a menudo fugas espaciales y una transferibilidad limitada de los índices boreales a biomas subtropicales. Presentamos D2, un operador de objetivos computacional que separa formalmente la ignición primaria de la propagación táctica, y un marco de inferencia con gating y evaluación que hace explícitos la construcción del objetivo, el control de fuga y la comparación de modelos. D2 define la ignición como fuego en el día</w:t>
+      </w:r>
+      <w:r>
+        <w:t xml:space="preserve"> </w:t>
+      </w:r>
+      <w:r>
+        <w:rPr>
+          <w:i/>
+          <w:iCs/>
+        </w:rPr>
+        <w:t xml:space="preserve">t</w:t>
+      </w:r>
+      <w:r>
+        <w:t xml:space="preserve"> </w:t>
+      </w:r>
+      <w:r>
+        <w:t xml:space="preserve">sin fuego a menos de 25 km en el día</w:t>
+      </w:r>
+      <w:r>
+        <w:t xml:space="preserve"> </w:t>
+      </w:r>
+      <w:r>
+        <w:rPr>
+          <w:i/>
+          <w:iCs/>
+        </w:rPr>
+        <w:t xml:space="preserve">t</w:t>
+      </w:r>
+      <w:r>
+        <w:t xml:space="preserve">−1 y sin fuego en la misma celda en los 10 días previos; la propagación se evalúa a menos de 25 km de un fuego del día</w:t>
+      </w:r>
+      <w:r>
+        <w:t xml:space="preserve"> </w:t>
+      </w:r>
+      <w:r>
+        <w:rPr>
+          <w:i/>
+          <w:iCs/>
+        </w:rPr>
+        <w:t xml:space="preserve">t</w:t>
+      </w:r>
+      <w:r>
+        <w:t xml:space="preserve">−1. Un gate biofísico elimina celdas-día no combustibles y húmedas. Un modelo híbrido LightGBM (M3) predice ignición sin insumos de fuego del día</w:t>
+      </w:r>
+      <w:r>
+        <w:t xml:space="preserve"> </w:t>
+      </w:r>
+      <w:r>
+        <w:rPr>
+          <w:i/>
+          <w:iCs/>
+        </w:rPr>
+        <w:t xml:space="preserve">t</w:t>
+      </w:r>
+      <w:r>
+        <w:t xml:space="preserve">−1, con M2 como fallback para celdas sin historia y M1 como baseline biofísico. En validación 2023, M3 alcanza ROC-AUC 0.7844/0.7628 (Chaco/Oriental) frente a 0.7817/0.7496 de M2. En bloques espaciales de desarrollo 2023, M2 es el más robusto (0.6773/0.7470) y M1 no supera a M2 en celdas sin historia. Un holdout independiente de confirmación retuvo a M2 como el mejor modelo espacial (0.6871/0.6621). En el test retrospectivo 2024–2025, M3 alcanza 0.8021/0.7534 frente a 0.5173/0.5564 del Canadian Forest Fire Weather Index (FWI) y 0.5389/0.4990 del INPE Risco de Fogo; la propagación alcanza 0.9039/0.7859. La precisión poblacional de ignición es 0.082 %/0.198 %, lo que confirma que el sistema es una herramienta de nowcast y priorización, no un sistema de alerta autónomo. La contribución computacional reside en el operador D2, la política de inferencia con gating y el arnés de evaluación abierto, publicado como software reproducible.</w:t>
       </w:r>
     </w:p>
     <w:p>

</xml_diff>